<commit_message>
docs: correct author attribution to Samuel Lawson per program registry decision; regenerate PDF/DOCX renders; update SHA256SUMS.txt
</commit_message>
<xml_diff>
--- a/paper/TCAIN_Working_Thesis_v1.0.docx
+++ b/paper/TCAIN_Working_Thesis_v1.0.docx
@@ -29,7 +29,7 @@
           <w:bCs/>
           <w:b/>
         </w:rPr>
-        <w:t xml:space="preserve">Author: Sam Flynn</w:t>
+        <w:t xml:space="preserve">Author: Samuel Lawson</w:t>
       </w:r>
       <w:r>
         <w:br/>
@@ -251,7 +251,7 @@
               <w:jc w:val="left"/>
             </w:pPr>
             <w:r>
-              <w:t xml:space="preserve">Sam Flynn, human operator. No model, node, conductor, validator, or derived document may self-promote or alter the operator-owned objective.</w:t>
+              <w:t xml:space="preserve">Samuel Lawson, human operator. No model, node, conductor, validator, or derived document may self-promote or alter the operator-owned objective.</w:t>
             </w:r>
           </w:p>
         </w:tc>
@@ -282,7 +282,7 @@
           <w:bCs/>
           <w:b/>
         </w:rPr>
-        <w:t xml:space="preserve">Sam Flynn</w:t>
+        <w:t xml:space="preserve">Samuel Lawson</w:t>
       </w:r>
       <w:r>
         <w:t xml:space="preserve">. The primary provenance artifacts are the handwritten triangle and four-directional node sketches reproduced in Appendix D. The originating concepts include: the distinction between trajectory and forced convergence; concurrence as an observed property rather than a required vote; adversarial engines positioned outside the reasoning course; deliberately controlled wrongness used to force self-questioning and course correction; written constitutions as a separate corrective pressure; four directional cells containing two models each; differentiated prompting across levels and perspectives; a governed center trajectory of work; and the possibility of recursively composing nodes as cells within larger nodes.</w:t>
@@ -293,7 +293,7 @@
         <w:pStyle w:val="BodyText"/>
       </w:pPr>
       <w:r>
-        <w:t xml:space="preserve">The formal vocabulary, related-work mapping, conductor analysis, state model, merge policy, metric proposals, threat model, experimental protocol, and publication structure were developed through an iterative, human-governed research dialogue between Sam Flynn and AI assistants. Those assistants served as analytical and editorial tools, not autonomous authors or final authorities. The author selected the objectives, corrected misunderstandings, supplied the core design, approved terminology, and retained final control over every claim. This report therefore attributes conceptual authorship to Sam Flynn while transparently acknowledging model-assisted formalization and drafting.</w:t>
+        <w:t xml:space="preserve">The formal vocabulary, related-work mapping, conductor analysis, state model, merge policy, metric proposals, threat model, experimental protocol, and publication structure were developed through an iterative, human-governed research dialogue between Samuel Lawson and AI assistants. Those assistants served as analytical and editorial tools, not autonomous authors or final authorities. The author selected the objectives, corrected misunderstandings, supplied the core design, approved terminology, and retained final control over every claim. This report therefore attributes conceptual authorship to Samuel Lawson while transparently acknowledging model-assisted formalization and drafting.</w:t>
       </w:r>
     </w:p>
     <w:p>
@@ -11717,7 +11717,7 @@
         <w:pStyle w:val="FirstParagraph"/>
       </w:pPr>
       <w:r>
-        <w:t xml:space="preserve">Trajectory-Constrained Adversarial Intelligence Nodes reframe multi-model reasoning as a governed trajectory-control problem. The work begins from Sam Flynn’s original triangular insight: convergence should not be forced by a fixed loop count or agreement gate; the system should observe whether reasoning is moving, correcting, and stabilizing in a useful direction. External adversarial engines deliberately challenge that course. Constitutional engines preserve mission, evidence, constraints, and authority. Four differentiated cells, each capable of containing two heterogeneous models, direct work toward a shared center state. A conductor governs integration, while a separate validator and human operator prevent synthesis from becoming self-authorized truth.</w:t>
+        <w:t xml:space="preserve">Trajectory-Constrained Adversarial Intelligence Nodes reframe multi-model reasoning as a governed trajectory-control problem. The work begins from Samuel Lawson’s original triangular insight: convergence should not be forced by a fixed loop count or agreement gate; the system should observe whether reasoning is moving, correcting, and stabilizing in a useful direction. External adversarial engines deliberately challenge that course. Constitutional engines preserve mission, evidence, constraints, and authority. Four differentiated cells, each capable of containing two heterogeneous models, direct work toward a shared center state. A conductor governs integration, while a separate validator and human operator prevent synthesis from becoming self-authorized truth.</w:t>
       </w:r>
     </w:p>
     <w:p>
@@ -15813,7 +15813,7 @@
       </w:r>
     </w:p>
     <w:bookmarkEnd w:id="189"/>
-    <w:bookmarkStart w:id="192" w:name="X793752340c3a4eef3df79d896182bfe21ed5ad8"/>
+    <w:bookmarkStart w:id="193" w:name="X793752340c3a4eef3df79d896182bfe21ed5ad8"/>
     <w:p>
       <w:pPr>
         <w:pStyle w:val="Heading1"/>
@@ -15980,12 +15980,30 @@
         <w:t xml:space="preserve">The epistemic-status table’s non-claims. The novelty boundary. Section 11’s sentience boundaries, which v0.1 already stated correctly. The voice.</w:t>
       </w:r>
     </w:p>
-    <w:bookmarkStart w:id="190" w:name="Xc3e114644e82e6fec2bfd4cf6c5c26d78c689e8"/>
+    <w:bookmarkStart w:id="190" w:name="v1.0.1-august-14-2026"/>
     <w:p>
       <w:pPr>
         <w:pStyle w:val="Heading2"/>
       </w:pPr>
       <w:r>
+        <w:t xml:space="preserve">v1.0.1 (August 14, 2026)</w:t>
+      </w:r>
+    </w:p>
+    <w:p>
+      <w:pPr>
+        <w:pStyle w:val="FirstParagraph"/>
+      </w:pPr>
+      <w:r>
+        <w:t xml:space="preserve">Author attribution corrected to Samuel Lawson per the program registry decision.</w:t>
+      </w:r>
+    </w:p>
+    <w:bookmarkEnd w:id="190"/>
+    <w:bookmarkStart w:id="191" w:name="Xc3e114644e82e6fec2bfd4cf6c5c26d78c689e8"/>
+    <w:p>
+      <w:pPr>
+        <w:pStyle w:val="Heading2"/>
+      </w:pPr>
+      <w:r>
         <w:t xml:space="preserve">v1.0 pre-release corrections (July 31, 2026)</w:t>
       </w:r>
     </w:p>
@@ -16012,8 +16030,8 @@
         <w:t xml:space="preserve">tokens had been mangled into line breaks by an earlier drafting pipeline; all display and inline math normalized to dollar-delimited form for GitHub and converter compatibility); rewired the Section 4.7 figure to the conductor-control-plane diagram, which had been orphaned while the runtime-cycle diagram was referenced twice, and renumbered Figures 4–6 into document order; corrected Section 12 subsection numbering (12.5–12.7); added in-text citations for references [25]–[27], which were listed but uncited; defined ATG in Appendix A and marked it in Section 9.5 as a companion concept under separate development with no implementation claimed; harmonized the Appendix E title in the Contents. All 27 references were independently verified against arXiv, the ACL Anthology, AAAI, ACM, and IEEE listings on 2026-07-31; every entry resolved with matching titles, author lists, and page numbers.</w:t>
       </w:r>
     </w:p>
-    <w:bookmarkEnd w:id="190"/>
-    <w:bookmarkStart w:id="191" w:name="v1.0-additions-july-30-2026"/>
+    <w:bookmarkEnd w:id="191"/>
+    <w:bookmarkStart w:id="192" w:name="v1.0-additions-july-30-2026"/>
     <w:p>
       <w:pPr>
         <w:pStyle w:val="Heading2"/>
@@ -16030,12 +16048,9 @@
         <w:t xml:space="preserve">Expanded authorship and development provenance; development chronology; three levels of adversarial action; current orchestration, sparse-topology, and collaboration-attack literature; refined novelty claim; node construction stack; full runtime cycle; logical versus physical concurrency; node profiles; transition and recovery operators; observability limits; falsification conditions; blinded adjudication; negative-result protocol; software decomposition; execution trace; TCAIN/SOVEREIGN/ATG boundary; human authority model; detailed threat model and containment assumptions; failure narratives; cognitive architecture hypotheses; limitations; publication ethics; full discussion; engineering roadmap; additional technical figures; machine-readable schemas; and a GitHub-ready repository package.</w:t>
       </w:r>
     </w:p>
-    <w:bookmarkEnd w:id="191"/>
     <w:bookmarkEnd w:id="192"/>
-    <w:sectPr>
-      <w:pgSz w:w="12240" w:h="15840"/>
-      <w:pgMar w:top="1008" w:right="1008" w:bottom="1008" w:left="1008" w:header="720" w:footer="720" w:gutter="0"/>
-    </w:sectPr>
+    <w:bookmarkEnd w:id="193"/>
+    <w:sectPr/>
   </w:body>
 </w:document>
 </file>
@@ -16663,7 +16678,7 @@
     <w:basedOn w:val="Normal"/>
     <w:link w:val="BodyTextChar"/>
     <w:pPr>
-      <w:spacing w:after="20" w:before="20" w:line="240" w:lineRule="auto"/>
+      <w:spacing w:after="180" w:before="180"/>
     </w:pPr>
     <w:qFormat/>
   </w:style>
@@ -16680,10 +16695,6 @@
     <w:pPr>
       <w:spacing w:after="36" w:before="36"/>
     </w:pPr>
-    <w:rPr>
-      <w:sz w:val="18"/>
-      <w:szCs w:val="18"/>
-    </w:rPr>
   </w:style>
   <w:style w:styleId="Title" w:type="paragraph">
     <w:name w:val="Title"/>
@@ -16792,7 +16803,7 @@
     <w:pPr>
       <w:keepNext/>
       <w:keepLines/>
-      <w:spacing w:after="40" w:before="120"/>
+      <w:spacing w:after="0" w:before="480"/>
       <w:outlineLvl w:val="0"/>
     </w:pPr>
     <w:rPr>
@@ -16814,7 +16825,7 @@
     <w:pPr>
       <w:keepNext/>
       <w:keepLines/>
-      <w:spacing w:after="40" w:before="120"/>
+      <w:spacing w:after="0" w:before="200"/>
       <w:outlineLvl w:val="1"/>
     </w:pPr>
     <w:rPr>
@@ -16836,7 +16847,7 @@
     <w:pPr>
       <w:keepNext/>
       <w:keepLines/>
-      <w:spacing w:after="40" w:before="120"/>
+      <w:spacing w:after="0" w:before="200"/>
       <w:outlineLvl w:val="2"/>
     </w:pPr>
     <w:rPr>
@@ -16858,7 +16869,7 @@
     <w:pPr>
       <w:keepNext/>
       <w:keepLines/>
-      <w:spacing w:after="40" w:before="120"/>
+      <w:spacing w:after="0" w:before="200"/>
       <w:outlineLvl w:val="3"/>
     </w:pPr>
     <w:rPr>
@@ -16880,7 +16891,7 @@
     <w:pPr>
       <w:keepNext/>
       <w:keepLines/>
-      <w:spacing w:after="40" w:before="120"/>
+      <w:spacing w:after="0" w:before="200"/>
       <w:outlineLvl w:val="4"/>
     </w:pPr>
     <w:rPr>
@@ -16901,7 +16912,7 @@
     <w:pPr>
       <w:keepNext/>
       <w:keepLines/>
-      <w:spacing w:after="40" w:before="120"/>
+      <w:spacing w:after="0" w:before="200"/>
       <w:outlineLvl w:val="5"/>
     </w:pPr>
     <w:rPr>
@@ -16921,7 +16932,7 @@
     <w:pPr>
       <w:keepNext/>
       <w:keepLines/>
-      <w:spacing w:after="40" w:before="120"/>
+      <w:spacing w:after="0" w:before="200"/>
       <w:outlineLvl w:val="6"/>
     </w:pPr>
     <w:rPr>
@@ -16941,7 +16952,7 @@
     <w:pPr>
       <w:keepNext/>
       <w:keepLines/>
-      <w:spacing w:after="40" w:before="120"/>
+      <w:spacing w:after="0" w:before="200"/>
       <w:outlineLvl w:val="7"/>
     </w:pPr>
     <w:rPr>
@@ -16961,7 +16972,7 @@
     <w:pPr>
       <w:keepNext/>
       <w:keepLines/>
-      <w:spacing w:after="40" w:before="120"/>
+      <w:spacing w:after="0" w:before="200"/>
       <w:outlineLvl w:val="8"/>
     </w:pPr>
     <w:rPr>
@@ -17006,9 +17017,9 @@
       <w:tblInd w:type="dxa" w:w="0"/>
       <w:tblCellMar>
         <w:top w:type="dxa" w:w="0"/>
-        <w:left w:type="dxa" w:w="80"/>
+        <w:left w:type="dxa" w:w="108"/>
         <w:bottom w:type="dxa" w:w="0"/>
-        <w:right w:type="dxa" w:w="80"/>
+        <w:right w:type="dxa" w:w="108"/>
       </w:tblCellMar>
     </w:tblPr>
     <w:tblStylePr w:type="firstRow">
@@ -17052,7 +17063,6 @@
       <w:spacing w:after="120" w:before="0"/>
     </w:pPr>
     <w:rPr>
-      <w:sz w:val="18"/>
       <w:i/>
     </w:rPr>
   </w:style>

</xml_diff>